<commit_message>
Rewrite both papers: fully latent SEM without composite scores, full SEM path diagrams with items and Latin labels, expanded theory with Persian literature, true footnotes, sensitivity analyses, latent-mean tests and factor-score ML
Co-Authored-By: Claude Sonnet 5.5 <noreply@anthropic.com>
Claude-Session: https://claude.ai/code/session_01B6hBNJS5eMNFXmCvfzEnc8
</commit_message>
<xml_diff>
--- a/fomo_two_papers/deliverables/paper1/Paper1_Extended_Abstract_FA_EN.docx
+++ b/fomo_two_papers/deliverables/paper1/Paper1_Extended_Abstract_FA_EN.docx
@@ -60,7 +60,7 @@
       <w:pPr>
         <w:keepNext/>
         <w:bidi/>
-        <w:spacing w:before="160" w:after="80" w:line="240" w:lineRule="auto"/>
+        <w:spacing w:before="110" w:after="50" w:line="240" w:lineRule="auto"/>
         <w:jc w:val="left"/>
       </w:pPr>
       <w:r>
@@ -78,7 +78,7 @@
     <w:p>
       <w:pPr>
         <w:bidi/>
-        <w:spacing w:before="0" w:after="80" w:line="240" w:lineRule="auto"/>
+        <w:spacing w:before="0" w:after="50" w:line="240" w:lineRule="auto"/>
         <w:jc w:val="both"/>
       </w:pPr>
       <w:r>
@@ -95,7 +95,7 @@
       <w:pPr>
         <w:keepNext/>
         <w:bidi/>
-        <w:spacing w:before="160" w:after="80" w:line="240" w:lineRule="auto"/>
+        <w:spacing w:before="110" w:after="50" w:line="240" w:lineRule="auto"/>
         <w:jc w:val="left"/>
       </w:pPr>
       <w:r>
@@ -113,7 +113,7 @@
     <w:p>
       <w:pPr>
         <w:bidi/>
-        <w:spacing w:before="0" w:after="80" w:line="240" w:lineRule="auto"/>
+        <w:spacing w:before="0" w:after="50" w:line="240" w:lineRule="auto"/>
         <w:jc w:val="both"/>
       </w:pPr>
       <w:r>
@@ -130,7 +130,7 @@
       <w:pPr>
         <w:keepNext/>
         <w:bidi/>
-        <w:spacing w:before="160" w:after="80" w:line="240" w:lineRule="auto"/>
+        <w:spacing w:before="110" w:after="50" w:line="240" w:lineRule="auto"/>
         <w:jc w:val="left"/>
       </w:pPr>
       <w:r>
@@ -148,7 +148,7 @@
     <w:p>
       <w:pPr>
         <w:bidi/>
-        <w:spacing w:before="0" w:after="80" w:line="240" w:lineRule="auto"/>
+        <w:spacing w:before="0" w:after="50" w:line="240" w:lineRule="auto"/>
         <w:jc w:val="both"/>
       </w:pPr>
       <w:r>
@@ -165,7 +165,7 @@
       <w:pPr>
         <w:keepNext/>
         <w:bidi/>
-        <w:spacing w:before="160" w:after="80" w:line="240" w:lineRule="auto"/>
+        <w:spacing w:before="110" w:after="50" w:line="240" w:lineRule="auto"/>
         <w:jc w:val="left"/>
       </w:pPr>
       <w:r>
@@ -183,24 +183,24 @@
     <w:p>
       <w:pPr>
         <w:bidi/>
-        <w:spacing w:before="0" w:after="80" w:line="240" w:lineRule="auto"/>
-        <w:jc w:val="both"/>
-      </w:pPr>
-      <w:r>
-        <w:rPr>
-          <w:rFonts w:ascii="Times New Roman" w:hAnsi="Times New Roman" w:cs="B Nazanin" w:eastAsia="Times New Roman"/>
-          <w:sz w:val="24"/>
-          <w:szCs w:val="24"/>
-          <w:lang w:val="en-US" w:bidi="fa-IR"/>
-        </w:rPr>
-        <w:t xml:space="preserve">مدل اندازه‌گیری برازش مطلوب داشت (⁦CFI = ۰٫۹۷۷⁩؛ ⁦RMSEA = ۰٫۰۳۰⁩؛ ⁦SRMR = ۰٫۰۳۷⁩) و پایایی و روایی پذیرفتنی بود. مواجهه فومو را افزایش داد (⁦β = ۰٫۴۹⁩، ⁦z = ۸٫۲۳⁩، ⁦p &lt; ۰٫۰۰۱⁩)، فومو رفتار توده‌وار را تقویت کرد (⁦β = ۰٫۴۱⁩، ⁦z = ۶٫۶۲⁩، ⁦p &lt; ۰٫۰۰۱⁩) و رفتار توده‌وار کیفیت تصمیم را کاهش داد (⁦β = −۰٫۳۵⁩، ⁦z = −۴٫۷۳⁩، ⁦p &lt; ۰٫۰۰۱⁩). اثر مستقیم مواجهه بر توده‌واری معنادار بود (⁦β = ۰٫۲۹⁩، ⁦z = ۴٫۷۵⁩، ⁦p &lt; ۰٫۰۰۱⁩). اثر غیرمستقیم متوالی استاندارد ⁦−۰٫۰۷۱⁩ با فاصلهٔ اطمینان [⁦−۰٫۱۱۱⁩، ⁦−۰٫۰۳۸⁩] بود. تعامل فومو × اطلاعات حسابداری منفی و معنادار بود (⁦β = −۰٫۱۸⁩، ⁦z = −۳٫۳۲⁩، ⁦p &lt; ۰٫۰۰۱⁩): شیب فومو ← توده‌واری از ۰٫۵۳ در سطح پایین به ۰٫۲۰ در سطح بالای اطلاعات حسابداری کاهش یافت و شاخص میانجی‌گری تعدیل‌شده ۰٫۰۳۴ [۰٫۰۱۳، ۰٫۰۶۵] بود. اثر مستقیم فومو بر کیفیت تصمیم معنادار نبود.</w:t>
+        <w:spacing w:before="0" w:after="50" w:line="240" w:lineRule="auto"/>
+        <w:jc w:val="both"/>
+      </w:pPr>
+      <w:r>
+        <w:rPr>
+          <w:rFonts w:ascii="Times New Roman" w:hAnsi="Times New Roman" w:cs="B Nazanin" w:eastAsia="Times New Roman"/>
+          <w:sz w:val="24"/>
+          <w:szCs w:val="24"/>
+          <w:lang w:val="en-US" w:bidi="fa-IR"/>
+        </w:rPr>
+        <w:t xml:space="preserve">مدل اندازه‌گیری برازش مطلوب داشت (⁦CFI = ۰٫۹۷۷⁩؛ ⁦RMSEA = ۰٫۰۳۰⁩؛ ⁦SRMR = ۰٫۰۳۷⁩) و پایایی و روایی پذیرفتنی بود. مواجهه فومو را افزایش داد (⁦β = ۰٫۴۹⁩، ⁦z = ۸٫۲۳⁩، ⁦p &lt; ۰٫۰۰۱⁩)، فومو رفتار توده‌وار را تقویت کرد (⁦β = ۰٫۴۱⁩، ⁦z = ۶٫۶۲⁩، ⁦p &lt; ۰٫۰۰۱⁩) و رفتار توده‌وار کیفیت تصمیم را کاهش داد (⁦β = −۰٫۳۵⁩، ⁦z = −۴٫۷۳⁩، ⁦p &lt; ۰٫۰۰۱⁩). اثر مستقیم مواجهه بر توده‌واری معنادار بود (⁦β = ۰٫۲۹⁩، ⁦z = ۴٫۷۵⁩، ⁦p &lt; ۰٫۰۰۱⁩). اثر غیرمستقیم متوالی استاندارد ⁦−۰٫۰۷۱⁩ با فاصلهٔ اطمینان [⁦−۰٫۱۱۱⁩، ⁦−۰٫۰۳۸⁩] بود. تعامل فومو × اطلاعات حسابداری منفی و معنادار بود (⁦β = −۰٫۱۸⁩، ⁦z = −۳٫۳۲⁩، ⁦p &lt; ۰٫۰۰۱⁩): شیب فومو ← توده‌واری از ۰٫۶۰ در سطح پایین به ۰٫۲۲ در سطح بالای اطلاعات حسابداری کاهش یافت و شاخص میانجی‌گری تعدیل‌شده ۰٫۰۳۴ [۰٫۰۱۳، ۰٫۰۶۵] بود. اثر مستقیم فومو بر کیفیت تصمیم معنادار نبود.</w:t>
       </w:r>
     </w:p>
     <w:p>
       <w:pPr>
         <w:keepNext/>
         <w:bidi/>
-        <w:spacing w:before="160" w:after="80" w:line="240" w:lineRule="auto"/>
+        <w:spacing w:before="110" w:after="50" w:line="240" w:lineRule="auto"/>
         <w:jc w:val="left"/>
       </w:pPr>
       <w:r>
@@ -218,7 +218,7 @@
     <w:p>
       <w:pPr>
         <w:bidi/>
-        <w:spacing w:before="0" w:after="80" w:line="240" w:lineRule="auto"/>
+        <w:spacing w:before="0" w:after="50" w:line="240" w:lineRule="auto"/>
         <w:jc w:val="both"/>
       </w:pPr>
       <w:r>
@@ -235,7 +235,7 @@
       <w:pPr>
         <w:keepNext/>
         <w:bidi/>
-        <w:spacing w:before="160" w:after="80" w:line="240" w:lineRule="auto"/>
+        <w:spacing w:before="110" w:after="50" w:line="240" w:lineRule="auto"/>
         <w:jc w:val="left"/>
       </w:pPr>
       <w:r>
@@ -253,7 +253,7 @@
     <w:p>
       <w:pPr>
         <w:bidi/>
-        <w:spacing w:before="0" w:after="80" w:line="240" w:lineRule="auto"/>
+        <w:spacing w:before="0" w:after="50" w:line="240" w:lineRule="auto"/>
         <w:jc w:val="both"/>
       </w:pPr>
       <w:r>
@@ -270,7 +270,7 @@
       <w:pPr>
         <w:keepNext/>
         <w:bidi/>
-        <w:spacing w:before="160" w:after="80" w:line="240" w:lineRule="auto"/>
+        <w:spacing w:before="110" w:after="50" w:line="240" w:lineRule="auto"/>
         <w:jc w:val="left"/>
       </w:pPr>
       <w:r>
@@ -288,7 +288,7 @@
     <w:p>
       <w:pPr>
         <w:bidi/>
-        <w:spacing w:before="0" w:after="80" w:line="240" w:lineRule="auto"/>
+        <w:spacing w:before="0" w:after="50" w:line="240" w:lineRule="auto"/>
         <w:jc w:val="both"/>
       </w:pPr>
       <w:r>
@@ -304,7 +304,7 @@
     <w:p>
       <w:pPr>
         <w:bidi/>
-        <w:spacing w:before="100" w:after="80" w:line="240" w:lineRule="auto"/>
+        <w:spacing w:before="100" w:after="50" w:line="240" w:lineRule="auto"/>
         <w:jc w:val="both"/>
       </w:pPr>
       <w:r>
@@ -509,7 +509,7 @@
           <w:szCs w:val="24"/>
           <w:lang w:val="en-US" w:bidi="fa-IR"/>
         </w:rPr>
-        <w:t xml:space="preserve">The measurement model fit well (CFI = 0.977, RMSEA = 0.030, SRMR = 0.037) with acceptable reliability and validity. Exposure increased FOMO (β = 0.49, z = 8.23, p &lt; .001), FOMO strengthened herding (β = 0.41, z = 6.62, p &lt; .001), and herding reduced decision quality (β = -0.35, z = -4.73, p &lt; .001). Exposure also had a direct effect on herding (β = 0.29, z = 4.75, p &lt; .001). The standardized sequential indirect effect was -0.071 (95% bootstrap CI [-0.111, -0.038]). The FOMO × accounting-information-use interaction was negative and significant (β = -0.18, z = -3.32, p &lt; .001): the slope of herding on FOMO fell from 0.53 at low to 0.20 at high accounting information use, and the index of moderated mediation was 0.034 [0.013, 0.065]. The direct effect of FOMO on decision quality was not significant.</w:t>
+        <w:t xml:space="preserve">The measurement model fit well (CFI = 0.977, RMSEA = 0.030, SRMR = 0.037) with acceptable reliability and validity. Exposure increased FOMO (β = 0.49, z = 8.23, p &lt; .001), FOMO strengthened herding (β = 0.41, z = 6.62, p &lt; .001), and herding reduced decision quality (β = -0.35, z = -4.73, p &lt; .001). Exposure also had a direct effect on herding (β = 0.29, z = 4.75, p &lt; .001). The standardized sequential indirect effect was -0.071 (95% bootstrap CI [-0.111, -0.038]). The FOMO × accounting-information-use interaction was negative and significant (β = -0.18, z = -3.32, p &lt; .001): the slope of herding on FOMO fell from 0.60 at low to 0.22 at high accounting information use, and the index of moderated mediation was 0.034 [0.013, 0.065]. The direct effect of FOMO on decision quality was not significant.</w:t>
       </w:r>
     </w:p>
     <w:p>
@@ -610,7 +610,7 @@
     </w:p>
     <w:p>
       <w:pPr>
-        <w:spacing w:before="100" w:after="80" w:line="240" w:lineRule="auto"/>
+        <w:spacing w:before="100" w:after="50" w:line="240" w:lineRule="auto"/>
         <w:jc w:val="left"/>
       </w:pPr>
       <w:r>

</xml_diff>